<commit_message>
Update with new contents
</commit_message>
<xml_diff>
--- a/public/Soomin Park - Resume 2025.docx
+++ b/public/Soomin Park - Resume 2025.docx
@@ -39,14 +39,26 @@
       </w:r>
     </w:p>
     <w:p>
-      <w:r>
-        <w:t>Link to portfolio</w:t>
-      </w:r>
-      <w:r>
-        <w:t xml:space="preserve">: </w:t>
-      </w:r>
-      <w:r>
-        <w:t>https://drive.google.com/file/d/1ZgSR-eDwYGOHs4JkyvuyFzasJwzFkyLs/view?usp=sharing</w:t>
+      <w:pPr>
+        <w:pStyle w:val="Heading1"/>
+      </w:pPr>
+      <w:r>
+        <w:t>Professional Summary</w:t>
+      </w:r>
+    </w:p>
+    <w:p>
+      <w:pPr>
+        <w:spacing w:after="240"/>
+      </w:pPr>
+      <w:r>
+        <w:t>Detail oriented and adaptive Junior Software Developer with hands on experience in application development, team collaboration, and problem solving. Skilled in JavaScript, C#, HTML, CSS, and modern frameworks such as React and Next.js.</w:t>
+      </w:r>
+      <w:r>
+        <w:br/>
+        <w:t>While early in my IT career, I bring proven experience from diverse professional environments where I learned how businesses operate, how to prioritize what matters, and how to collaborate effectively. With a strong development mindset and eagerness to learn, I am confident in my ability to contribute meaningfully to your development team</w:t>
+      </w:r>
+      <w:r>
+        <w:t>.</w:t>
       </w:r>
     </w:p>
     <w:p>
@@ -54,34 +66,11 @@
         <w:pStyle w:val="Heading1"/>
       </w:pPr>
       <w:r>
-        <w:t>Professional Summary</w:t>
+        <w:t>Technical Skills</w:t>
       </w:r>
     </w:p>
     <w:p>
       <w:pPr>
-        <w:spacing w:after="240"/>
-      </w:pPr>
-      <w:r>
-        <w:t>Detail oriented and adaptive Junior Software Developer with hands on experience in application development, team collaboration, and problem solving. Skilled in JavaScript, C#, HTML, CSS, and modern frameworks such as React and Next.js.</w:t>
-      </w:r>
-      <w:r>
-        <w:br/>
-        <w:t>While early in my IT career, I bring proven experience from diverse professional environments where I learned how businesses operate, how to prioritize what matters, and how to collaborate effectively. With a strong development mindset and eagerness to learn, I am confident in my ability to contribute meaningfully to your development team</w:t>
-      </w:r>
-      <w:r>
-        <w:t>.</w:t>
-      </w:r>
-    </w:p>
-    <w:p>
-      <w:pPr>
-        <w:pStyle w:val="Heading1"/>
-      </w:pPr>
-      <w:r>
-        <w:t>Technical Skills</w:t>
-      </w:r>
-    </w:p>
-    <w:p>
-      <w:pPr>
         <w:rPr>
           <w:rFonts w:eastAsia="맑은 고딕"/>
           <w:lang w:eastAsia="ko-KR"/>
@@ -265,7 +254,7 @@
           <w:rFonts w:eastAsia="맑은 고딕"/>
           <w:lang w:eastAsia="ko-KR"/>
         </w:rPr>
-        <w:t>Security: Secure coding, authentication &amp; authorization</w:t>
+        <w:t>Tools: VS Code, Visual Studio, IntelliJ IDEA</w:t>
       </w:r>
       <w:r>
         <w:rPr>
@@ -279,21 +268,14 @@
           <w:rFonts w:eastAsia="맑은 고딕"/>
           <w:lang w:eastAsia="ko-KR"/>
         </w:rPr>
-        <w:t>Tools: VS Code, Visual Studio, IntelliJ IDEA</w:t>
+        <w:t>Documentation: Technical and process documentation</w:t>
       </w:r>
       <w:r>
         <w:rPr>
           <w:rFonts w:eastAsia="맑은 고딕"/>
           <w:lang w:eastAsia="ko-KR"/>
         </w:rPr>
-        <w:br/>
-      </w:r>
-      <w:r>
-        <w:rPr>
-          <w:rFonts w:eastAsia="맑은 고딕"/>
-          <w:lang w:eastAsia="ko-KR"/>
-        </w:rPr>
-        <w:t>Documentation: Technical and process documentation</w:t>
+        <w:t>, User manual</w:t>
       </w:r>
     </w:p>
     <w:p>
@@ -521,7 +503,6 @@
         </w:rPr>
       </w:pPr>
       <w:r>
-        <w:lastRenderedPageBreak/>
         <w:t xml:space="preserve">2008 </w:t>
       </w:r>
       <w:r>
@@ -548,6 +529,7 @@
         <w:pStyle w:val="Heading1"/>
       </w:pPr>
       <w:r>
+        <w:lastRenderedPageBreak/>
         <w:t>Experience</w:t>
       </w:r>
     </w:p>
@@ -967,6 +949,15 @@
           <w:lang w:eastAsia="ko-KR"/>
         </w:rPr>
         <w:t>2014</w:t>
+      </w:r>
+      <w:r>
+        <w:rPr>
+          <w:rFonts w:eastAsia="맑은 고딕"/>
+          <w:b/>
+          <w:bCs/>
+          <w:lang w:eastAsia="ko-KR"/>
+        </w:rPr>
+        <w:t xml:space="preserve"> - 2014</w:t>
       </w:r>
     </w:p>
     <w:p>
@@ -1286,20 +1277,93 @@
     <w:p>
       <w:pPr>
         <w:pStyle w:val="ListBullet"/>
+        <w:numPr>
+          <w:ilvl w:val="0"/>
+          <w:numId w:val="0"/>
+        </w:numPr>
+        <w:rPr>
+          <w:b/>
+          <w:bCs/>
+        </w:rPr>
       </w:pPr>
       <w:r>
-        <w:t xml:space="preserve">Deployed on </w:t>
-      </w:r>
-      <w:proofErr w:type="spellStart"/>
-      <w:r>
-        <w:t>Vercel</w:t>
-      </w:r>
-      <w:proofErr w:type="spellEnd"/>
-      <w:r>
-        <w:t xml:space="preserve"> with f</w:t>
-      </w:r>
-      <w:r>
-        <w:t>eatures like notice board, roster management, and raid logs</w:t>
+        <w:rPr>
+          <w:b/>
+          <w:bCs/>
+        </w:rPr>
+        <w:t>NAIT Capstone Project - Athlete Performance System</w:t>
+      </w:r>
+      <w:r>
+        <w:rPr>
+          <w:b/>
+          <w:bCs/>
+        </w:rPr>
+        <w:t xml:space="preserve"> </w:t>
+      </w:r>
+      <w:r>
+        <w:rPr>
+          <w:b/>
+          <w:bCs/>
+        </w:rPr>
+        <w:t>(</w:t>
+      </w:r>
+      <w:r>
+        <w:rPr>
+          <w:b/>
+          <w:bCs/>
+        </w:rPr>
+        <w:t>https://www.proathletemetrics.com/</w:t>
+      </w:r>
+      <w:r>
+        <w:rPr>
+          <w:b/>
+          <w:bCs/>
+        </w:rPr>
+        <w:t>)</w:t>
+      </w:r>
+    </w:p>
+    <w:p>
+      <w:pPr>
+        <w:pStyle w:val="ListBullet"/>
+      </w:pPr>
+      <w:r>
+        <w:t>Role: Tech Lead</w:t>
+      </w:r>
+      <w:r>
+        <w:rPr>
+          <w:rFonts w:eastAsia="맑은 고딕"/>
+          <w:lang w:eastAsia="ko-KR"/>
+        </w:rPr>
+        <w:t xml:space="preserve"> - </w:t>
+      </w:r>
+      <w:r>
+        <w:t>Led technical direction and architecture for a new athlete testing platform</w:t>
+      </w:r>
+    </w:p>
+    <w:p>
+      <w:pPr>
+        <w:pStyle w:val="ListBullet"/>
+      </w:pPr>
+      <w:r>
+        <w:t xml:space="preserve">Designed and implemented </w:t>
+      </w:r>
+      <w:r>
+        <w:t xml:space="preserve">overall architecture, </w:t>
+      </w:r>
+      <w:r>
+        <w:t>workflow, data handling, rating calculations, dashboard, and AI integration</w:t>
+      </w:r>
+    </w:p>
+    <w:p>
+      <w:pPr>
+        <w:pStyle w:val="ListBullet"/>
+        <w:rPr>
+          <w:rFonts w:eastAsia="맑은 고딕"/>
+          <w:lang w:eastAsia="ko-KR"/>
+        </w:rPr>
+      </w:pPr>
+      <w:r>
+        <w:t>Facilitated team meetings, documented requirements, and ensured data integrity</w:t>
       </w:r>
     </w:p>
     <w:p>
@@ -1310,42 +1374,39 @@
           <w:numId w:val="0"/>
         </w:numPr>
         <w:rPr>
+          <w:rFonts w:eastAsia="맑은 고딕"/>
           <w:b/>
           <w:bCs/>
+          <w:lang w:eastAsia="ko-KR"/>
         </w:rPr>
       </w:pPr>
       <w:r>
         <w:rPr>
+          <w:rFonts w:eastAsia="맑은 고딕"/>
           <w:b/>
           <w:bCs/>
-        </w:rPr>
-        <w:t>NAIT Capstone Project - Athlete Performance System</w:t>
-      </w:r>
-      <w:r>
-        <w:rPr>
+          <w:lang w:eastAsia="ko-KR"/>
+        </w:rPr>
+        <w:t>Restaurant Website (Dec, 2025) (</w:t>
+      </w:r>
+      <w:hyperlink r:id="rId7" w:history="1">
+        <w:r>
+          <w:rPr>
+            <w:rStyle w:val="Hyperlink"/>
+            <w:rFonts w:eastAsia="맑은 고딕"/>
+            <w:b/>
+            <w:bCs/>
+            <w:lang w:eastAsia="ko-KR"/>
+          </w:rPr>
+          <w:t>https://so-poong.ca</w:t>
+        </w:r>
+      </w:hyperlink>
+      <w:r>
+        <w:rPr>
+          <w:rFonts w:eastAsia="맑은 고딕"/>
           <w:b/>
           <w:bCs/>
-        </w:rPr>
-        <w:t xml:space="preserve"> </w:t>
-      </w:r>
-      <w:r>
-        <w:rPr>
-          <w:b/>
-          <w:bCs/>
-        </w:rPr>
-        <w:t>(</w:t>
-      </w:r>
-      <w:r>
-        <w:rPr>
-          <w:b/>
-          <w:bCs/>
-        </w:rPr>
-        <w:t>https://www.proathletemetrics.com/</w:t>
-      </w:r>
-      <w:r>
-        <w:rPr>
-          <w:b/>
-          <w:bCs/>
+          <w:lang w:eastAsia="ko-KR"/>
         </w:rPr>
         <w:t>)</w:t>
       </w:r>
@@ -1353,43 +1414,96 @@
     <w:p>
       <w:pPr>
         <w:pStyle w:val="ListBullet"/>
+        <w:rPr>
+          <w:lang w:eastAsia="ko-KR"/>
+        </w:rPr>
       </w:pPr>
       <w:r>
-        <w:t>Role: Tech Lead</w:t>
+        <w:rPr>
+          <w:rFonts w:eastAsia="맑은 고딕" w:hint="eastAsia"/>
+          <w:lang w:eastAsia="ko-KR"/>
+        </w:rPr>
+        <w:t>F</w:t>
+      </w:r>
+      <w:r>
+        <w:rPr>
+          <w:rFonts w:eastAsia="맑은 고딕"/>
+          <w:lang w:eastAsia="ko-KR"/>
+        </w:rPr>
+        <w:t>irst personal commercial project</w:t>
       </w:r>
     </w:p>
     <w:p>
       <w:pPr>
         <w:pStyle w:val="ListBullet"/>
+        <w:rPr>
+          <w:lang w:eastAsia="ko-KR"/>
+        </w:rPr>
       </w:pPr>
       <w:r>
-        <w:t>Led technical direction and architecture for a new athlete testing platform</w:t>
+        <w:rPr>
+          <w:rFonts w:eastAsia="맑은 고딕"/>
+          <w:lang w:eastAsia="ko-KR"/>
+        </w:rPr>
+        <w:t>Implemented responsive design with CRUD for easy management</w:t>
       </w:r>
     </w:p>
     <w:p>
       <w:pPr>
         <w:pStyle w:val="ListBullet"/>
+        <w:rPr>
+          <w:rFonts w:hint="eastAsia"/>
+          <w:lang w:eastAsia="ko-KR"/>
+        </w:rPr>
       </w:pPr>
       <w:r>
-        <w:t xml:space="preserve">Designed and implemented </w:t>
-      </w:r>
-      <w:r>
-        <w:t xml:space="preserve">overall architecture, </w:t>
-      </w:r>
-      <w:r>
-        <w:t>workflow, data handling, rating calculations, dashboard, and AI integration</w:t>
-      </w:r>
-    </w:p>
-    <w:p>
-      <w:pPr>
-        <w:pStyle w:val="ListBullet"/>
+        <w:rPr>
+          <w:rFonts w:eastAsia="맑은 고딕" w:hint="eastAsia"/>
+          <w:lang w:eastAsia="ko-KR"/>
+        </w:rPr>
+        <w:t>L</w:t>
+      </w:r>
+      <w:r>
         <w:rPr>
           <w:rFonts w:eastAsia="맑은 고딕"/>
           <w:lang w:eastAsia="ko-KR"/>
         </w:rPr>
-      </w:pPr>
-      <w:r>
-        <w:t>Facilitated team meetings, documented requirements, and ensured data integrity</w:t>
+        <w:t>ots of interactive</w:t>
+      </w:r>
+      <w:r>
+        <w:rPr>
+          <w:rFonts w:eastAsia="맑은 고딕"/>
+          <w:lang w:eastAsia="ko-KR"/>
+        </w:rPr>
+        <w:t xml:space="preserve"> moving </w:t>
+      </w:r>
+      <w:r>
+        <w:rPr>
+          <w:rFonts w:eastAsia="맑은 고딕"/>
+          <w:lang w:eastAsia="ko-KR"/>
+        </w:rPr>
+        <w:t>components</w:t>
+      </w:r>
+      <w:r>
+        <w:rPr>
+          <w:rFonts w:eastAsia="맑은 고딕" w:hint="eastAsia"/>
+          <w:lang w:eastAsia="ko-KR"/>
+        </w:rPr>
+        <w:t xml:space="preserve"> </w:t>
+      </w:r>
+      <w:r>
+        <w:rPr>
+          <w:rFonts w:eastAsia="맑은 고딕"/>
+          <w:lang w:eastAsia="ko-KR"/>
+        </w:rPr>
+        <w:t>with f</w:t>
+      </w:r>
+      <w:r>
+        <w:rPr>
+          <w:rFonts w:eastAsia="맑은 고딕"/>
+          <w:lang w:eastAsia="ko-KR"/>
+        </w:rPr>
+        <w:t>ull SEO applied.</w:t>
       </w:r>
     </w:p>
     <w:p>

</xml_diff>